<commit_message>
Remove accidentally-committed gibbs_minimization_2026 paperlab artifacts from PR
The neqsim-paperlab/papers/gibbs_minimization_2026/ directory is gitignored (per .gitignore: neqsim-paperlab/papers/*/) but two earlier 'update' commits on this branch (1e4f359a, 6bc23c29) accidentally bundled local paper-render outputs (paper.pdf, paper.typ, submission figures) plus a build_word.py edit. These changes are unrelated to PR #2325 (linear recovery-factor allocation) and triggered the paperlab_replication_gate workflow to demand results.json for a paper that does not own that file, causing CI failure. Restore the index to the origin/master tree for this path; working-tree files remain on disk (still gitignored).
</commit_message>
<xml_diff>
--- a/neqsim-paperlab/papers/gibbs_minimization_2026/submission/paper.docx
+++ b/neqsim-paperlab/papers/gibbs_minimization_2026/submission/paper.docx
@@ -277,7 +277,7 @@
           <w:rFonts w:ascii="Times New Roman" w:hAnsi="Times New Roman"/>
           <w:sz w:val="22"/>
         </w:rPr>
-        <w:t>The calculation of chemical equilibrium compositions is a fundamental problem in chemical engineering, combustion science, and materials processing. Given a set of chemical species at specified temperature and pressure, the equilibrium state corresponds to the global minimum of the total Gibbs free energy subject to conservation of chemical elements (White et al., 1958; Smith and Missen, 1982).</w:t>
+        <w:t>The calculation of chemical equilibrium compositions is a fundamental problem in chemical engineering, combustion science, and materials processing. Given a set of chemical species at specified temperature and pressure, the equilibrium state corresponds to the global minimum of the total Gibbs free energy subject to conservation of chemical elements [19, 25].</w:t>
       </w:r>
     </w:p>
     <w:p>
@@ -286,7 +286,7 @@
           <w:rFonts w:ascii="Times New Roman" w:hAnsi="Times New Roman"/>
           <w:sz w:val="22"/>
         </w:rPr>
-        <w:t>Two principal approaches exist for computing chemical equilibrium: the stoichiometric method, which parameterizes the problem in terms of extents of independent reactions, and the non-stoichiometric (direct minimization) method, which treats all species mole numbers as variables subject to element balance constraints (Smith et al., 2005). The non-stoichiometric approach is more general because it does not require enumeration of independent reactions and handles systems where the reaction set is large or unknown (Gordon and McBride, 1994).</w:t>
+        <w:t>Two principal approaches exist for computing chemical equilibrium: the stoichiometric method, which parameterizes the problem in terms of extents of independent reactions, and the non-stoichiometric (direct minimization) method, which treats all species mole numbers as variables subject to element balance constraints [20]. The non-stoichiometric approach is more general because it does not require enumeration of independent reactions and handles systems where the reaction set is large or unknown [5].</w:t>
       </w:r>
     </w:p>
     <w:p>
@@ -295,7 +295,7 @@
           <w:rFonts w:ascii="Times New Roman" w:hAnsi="Times New Roman"/>
           <w:sz w:val="22"/>
         </w:rPr>
-        <w:t>The most widely used non-stoichiometric formulation introduces Lagrange multipliers for the element mass balance constraints, leading to a system of nonlinear equations known as the Karush-Kuhn-Tucker (KKT) conditions (Smith and Missen, 1982; Michelsen and Mollerup, 2007). Newton-Raphson iteration on this KKT system is the standard solution method, used in major equilibrium codes including NASA CEA (Gordon and McBride, 1994; McBride and Gordon, 1996), STANJAN (Reynolds, 1986), SOLGAS (Eriksson, 1971), and numerous process simulators.</w:t>
+        <w:t>The most widely used non-stoichiometric formulation introduces Lagrange multipliers for the element mass balance constraints, leading to a system of nonlinear equations known as the Karush-Kuhn-Tucker (KKT) conditions [13, 19]. Newton-Raphson iteration on this KKT system is the standard solution method, used in major equilibrium codes including NASA CEA [5, 10], STANJAN [18], SOLGAS [4], and numerous process simulators.</w:t>
       </w:r>
     </w:p>
     <w:p>
@@ -368,7 +368,7 @@
           <w:rFonts w:ascii="Times New Roman" w:hAnsi="Times New Roman"/>
           <w:sz w:val="22"/>
         </w:rPr>
-        <w:t>, typically 0.01 to 0.1 (Greiner, 1991). Simple but overly conservative.</w:t>
+        <w:t>, typically 0.01 to 0.1 [6]. Simple but overly conservative.</w:t>
       </w:r>
     </w:p>
     <w:p>
@@ -396,7 +396,7 @@
           <w:rFonts w:ascii="Times New Roman" w:hAnsi="Times New Roman"/>
           <w:sz w:val="22"/>
         </w:rPr>
-        <w:t>, bounding the maximum change in log-mole numbers per iteration (Gordon and McBride, 1994). Effective but specific to the log-mole formulation.</w:t>
+        <w:t>, bounding the maximum change in log-mole numbers per iteration [5]. Effective but specific to the log-mole formulation.</w:t>
       </w:r>
     </w:p>
     <w:p>
@@ -424,7 +424,7 @@
           <w:rFonts w:ascii="Times New Roman" w:hAnsi="Times New Roman"/>
           <w:sz w:val="22"/>
         </w:rPr>
-        <w:t>, scaling the step based on the ratio of actual to predicted Gibbs energy decrease (Tsanas et al., 2018). Requires careful tuning.</w:t>
+        <w:t>, scaling the step based on the ratio of actual to predicted Gibbs energy decrease [23]. Requires careful tuning.</w:t>
       </w:r>
     </w:p>
     <w:p>
@@ -433,7 +433,7 @@
           <w:rFonts w:ascii="Times New Roman" w:hAnsi="Times New Roman"/>
           <w:sz w:val="22"/>
         </w:rPr>
-        <w:t>None of these approaches provides a formal guarantee of monotonic decrease in the objective function. In optimization theory, such guarantees are provided by line search methods satisfying the Armijo condition (Nocedal and Wright, 2006; Armijo, 1966), which are standard in unconstrained optimization but have not been systematically applied to constrained Gibbs minimization with Lagrange multipliers.</w:t>
+        <w:t>None of these approaches provides a formal guarantee of monotonic decrease in the objective function. In optimization theory, such guarantees are provided by line search methods satisfying the Armijo condition [1, 15], which are standard in unconstrained optimization but have not been systematically applied to constrained Gibbs minimization with Lagrange multipliers.</w:t>
       </w:r>
     </w:p>
     <w:p>
@@ -442,7 +442,7 @@
           <w:rFonts w:ascii="Times New Roman" w:hAnsi="Times New Roman"/>
           <w:sz w:val="22"/>
         </w:rPr>
-        <w:t>A second practical difficulty arises when the KKT Jacobian matrix becomes ill-conditioned. This occurs when some species are present in trace amounts, when the element balance matrix is nearly rank-deficient, or when the equation of state produces near-singular fugacity derivative matrices (Leal et al., 2016). Standard Newton-Raphson produces unreliable steps in these situations.</w:t>
+        <w:t>A second practical difficulty arises when the KKT Jacobian matrix becomes ill-conditioned. This occurs when some species are present in trace amounts, when the element balance matrix is nearly rank-deficient, or when the equation of state produces near-singular fugacity derivative matrices [9]. Standard Newton-Raphson produces unreliable steps in these situations.</w:t>
       </w:r>
     </w:p>
     <w:p>
@@ -451,7 +451,7 @@
           <w:rFonts w:ascii="Times New Roman" w:hAnsi="Times New Roman"/>
           <w:sz w:val="22"/>
         </w:rPr>
-        <w:t>Most existing implementations assume ideal gas behavior or use activity coefficient models for the excess Gibbs energy (Smith and Missen, 1982; Gordon and McBride, 1994). For process simulation at high pressures, cubic equations of state such as Soave-Redlich-Kwong (Soave, 1972) or Peng-Robinson (Peng and Robinson, 1976) introduce additional complexity through fugacity coefficient derivatives that affect the Hessian matrix.</w:t>
+        <w:t>Most existing implementations assume ideal gas behavior or use activity coefficient models for the excess Gibbs energy [5, 19]. For process simulation at high pressures, cubic equations of state such as Soave-Redlich-Kwong [21] or Peng-Robinson [16] introduce additional complexity through fugacity coefficient derivatives that affect the Hessian matrix.</w:t>
       </w:r>
     </w:p>
     <w:p>
@@ -473,7 +473,7 @@
           <w:rFonts w:ascii="Times New Roman" w:hAnsi="Times New Roman"/>
           <w:sz w:val="22"/>
         </w:rPr>
-        <w:t>White et al. (White et al., 1958) established the mathematical framework for Gibbs minimization as a constrained optimization problem and introduced Lagrange multipliers for the element balance constraints. Villars (Villars, 1959) developed early successive approximation methods for combustion equilibria.</w:t>
+        <w:t>White et al. [25] established the mathematical framework for Gibbs minimization as a constrained optimization problem and introduced Lagrange multipliers for the element balance constraints. Villars [24] developed early successive approximation methods for combustion equilibria.</w:t>
       </w:r>
     </w:p>
     <w:p>
@@ -482,7 +482,7 @@
           <w:rFonts w:ascii="Times New Roman" w:hAnsi="Times New Roman"/>
           <w:sz w:val="22"/>
         </w:rPr>
-        <w:t>Gordon and McBride (Gordon and McBride, 1994) created the NASA CEA code, which remains the standard reference implementation. CEA works in the log-mole number space, uses a steepest-descent correction to handle trace species, and employs adaptive step limiting based on the maximum correction magnitude. However, CEA is restricted to ideal gas or ideal condensed phases and does not incorporate equation-of-state non-ideality.</w:t>
+        <w:t>Gordon and McBride [5] created the NASA CEA code, which remains the standard reference implementation. CEA works in the log-mole number space, uses a steepest-descent correction to handle trace species, and employs adaptive step limiting based on the maximum correction magnitude. However, CEA is restricted to ideal gas or ideal condensed phases and does not incorporate equation-of-state non-ideality.</w:t>
       </w:r>
     </w:p>
     <w:p>
@@ -491,7 +491,7 @@
           <w:rFonts w:ascii="Times New Roman" w:hAnsi="Times New Roman"/>
           <w:sz w:val="22"/>
         </w:rPr>
-        <w:t>Eriksson (Eriksson, 1971) developed SOLGAS for high-temperature equilibria, while Reynolds (Reynolds, 1986) created STANJAN using the element potential method. These methods handle ideal systems efficiently but face difficulties with non-ideal EOS.</w:t>
+        <w:t>Eriksson [4] developed SOLGAS for high-temperature equilibria, while Reynolds [18] created STANJAN using the element potential method. These methods handle ideal systems efficiently but face difficulties with non-ideal EOS.</w:t>
       </w:r>
     </w:p>
     <w:p>
@@ -500,7 +500,7 @@
           <w:rFonts w:ascii="Times New Roman" w:hAnsi="Times New Roman"/>
           <w:sz w:val="22"/>
         </w:rPr>
-        <w:t>Greiner (Greiner, 1991) presented an efficient Newton implementation for nonideal chemical equilibria using an activity coefficient model. Koukkari and Pajarre (Koukkari and Pajarre, 2006) extended constrained Gibbs minimization to include non-standard constraints such as surface energies and electrochemical potentials.</w:t>
+        <w:t>Greiner [6] presented an efficient Newton implementation for nonideal chemical equilibria using an activity coefficient model. Koukkari and Pajarre [8] extended constrained Gibbs minimization to include non-standard constraints such as surface energies and electrochemical potentials.</w:t>
       </w:r>
     </w:p>
     <w:p>
@@ -509,7 +509,7 @@
           <w:rFonts w:ascii="Times New Roman" w:hAnsi="Times New Roman"/>
           <w:sz w:val="22"/>
         </w:rPr>
-        <w:t>Tsanas et al. (Tsanas et al., 2018) developed a modified RAND method for multiphase chemical equilibrium that handles simultaneous phase and reaction equilibrium, providing a comprehensive framework but with significant implementation complexity.</w:t>
+        <w:t>Tsanas et al. [23] developed a modified RAND method for multiphase chemical equilibrium that handles simultaneous phase and reaction equilibrium, providing a comprehensive framework but with significant implementation complexity.</w:t>
       </w:r>
     </w:p>
     <w:p>
@@ -518,7 +518,7 @@
           <w:rFonts w:ascii="Times New Roman" w:hAnsi="Times New Roman"/>
           <w:sz w:val="22"/>
         </w:rPr>
-        <w:t>Leal et al. (Leal et al., 2016) developed the xLMA method for reactive transport, addressing the ill-conditioning challenges in geochemical systems with many trace species by reformulating the problem using extended law of mass action.</w:t>
+        <w:t>Leal et al. [9] developed the xLMA method for reactive transport, addressing the ill-conditioning challenges in geochemical systems with many trace species by reformulating the problem using extended law of mass action.</w:t>
       </w:r>
     </w:p>
     <w:p>
@@ -527,7 +527,7 @@
           <w:rFonts w:ascii="Times New Roman" w:hAnsi="Times New Roman"/>
           <w:sz w:val="22"/>
         </w:rPr>
-        <w:t>Michelsen and Mollerup (Michelsen and Mollerup, 2007) provide the definitive treatment of thermodynamic modeling and flash calculations with cubic EOS but focus on phase equilibrium rather than chemical equilibrium.</w:t>
+        <w:t>Michelsen and Mollerup [13] provide the definitive treatment of thermodynamic modeling and flash calculations with cubic EOS but focus on phase equilibrium rather than chemical equilibrium.</w:t>
       </w:r>
     </w:p>
     <w:p>
@@ -536,7 +536,7 @@
           <w:rFonts w:ascii="Times New Roman" w:hAnsi="Times New Roman"/>
           <w:sz w:val="22"/>
         </w:rPr>
-        <w:t>In the optimization literature, Nocedal and Wright (Nocedal and Wright, 2006) present comprehensive globalization strategies (line search and trust region) for Newton methods that guarantee convergence from any starting point, but these have not been systematically applied to the specific structure of the chemical equilibrium KKT system.</w:t>
+        <w:t>In the optimization literature, Nocedal and Wright [15] present comprehensive globalization strategies (line search and trust region) for Newton methods that guarantee convergence from any starting point, but these have not been systematically applied to the specific structure of the chemical equilibrium KKT system.</w:t>
       </w:r>
     </w:p>
     <w:p>
@@ -974,16 +974,18 @@
         </m:r>
         <m:sSub>
           <m:e>
-            <m:acc>
-              <m:accPr>
-                <m:chr m:val="̂"/>
-              </m:accPr>
+            <m:limUpp>
               <m:e>
                 <m:r>
                   <m:t>ϕ</m:t>
                 </m:r>
               </m:e>
-            </m:acc>
+              <m:lim>
+                <m:r>
+                  <m:t>^</m:t>
+                </m:r>
+              </m:lim>
+            </m:limUpp>
           </m:e>
           <m:sub>
             <m:r>
@@ -1097,16 +1099,18 @@
       <m:oMath>
         <m:sSub>
           <m:e>
-            <m:acc>
-              <m:accPr>
-                <m:chr m:val="̂"/>
-              </m:accPr>
+            <m:limUpp>
               <m:e>
                 <m:r>
                   <m:t>ϕ</m:t>
                 </m:r>
               </m:e>
-            </m:acc>
+              <m:lim>
+                <m:r>
+                  <m:t>^</m:t>
+                </m:r>
+              </m:lim>
+            </m:limUpp>
           </m:e>
           <m:sub>
             <m:r>
@@ -2312,16 +2316,18 @@
             </m:r>
             <m:sSub>
               <m:e>
-                <m:acc>
-                  <m:accPr>
-                    <m:chr m:val="̂"/>
-                  </m:accPr>
+                <m:limUpp>
                   <m:e>
                     <m:r>
                       <m:t>ϕ</m:t>
                     </m:r>
                   </m:e>
-                </m:acc>
+                  <m:lim>
+                    <m:r>
+                      <m:t>^</m:t>
+                    </m:r>
+                  </m:lim>
+                </m:limUpp>
               </m:e>
               <m:sub>
                 <m:r>
@@ -2377,16 +2383,18 @@
         </m:r>
         <m:sSub>
           <m:e>
-            <m:acc>
-              <m:accPr>
-                <m:chr m:val="̂"/>
-              </m:accPr>
+            <m:limUpp>
               <m:e>
                 <m:r>
                   <m:t>ϕ</m:t>
                 </m:r>
               </m:e>
-            </m:acc>
+              <m:lim>
+                <m:r>
+                  <m:t>^</m:t>
+                </m:r>
+              </m:lim>
+            </m:limUpp>
           </m:e>
           <m:sub>
             <m:r>
@@ -2456,16 +2464,18 @@
         </m:r>
         <m:sSub>
           <m:e>
-            <m:acc>
-              <m:accPr>
-                <m:chr m:val="̂"/>
-              </m:accPr>
+            <m:limUpp>
               <m:e>
                 <m:r>
                   <m:t>ϕ</m:t>
                 </m:r>
               </m:e>
-            </m:acc>
+              <m:lim>
+                <m:r>
+                  <m:t>^</m:t>
+                </m:r>
+              </m:lim>
+            </m:limUpp>
           </m:e>
           <m:sub>
             <m:r>
@@ -2708,7 +2718,7 @@
           <w:rFonts w:ascii="Times New Roman" w:hAnsi="Times New Roman"/>
           <w:sz w:val="22"/>
         </w:rPr>
-        <w:t xml:space="preserve"> may diverge far from the solution. We replace fixed damping with an Armijo backtracking line search (Armijo, 1966; Nocedal and Wright, 2006) that adapts </w:t>
+        <w:t xml:space="preserve"> may diverge far from the solution. We replace fixed damping with an Armijo backtracking line search [1, 15] that adapts </w:t>
       </w:r>
       <m:oMath>
         <m:r>
@@ -3337,7 +3347,7 @@
           <w:rFonts w:ascii="Times New Roman" w:hAnsi="Times New Roman"/>
           <w:sz w:val="22"/>
         </w:rPr>
-        <w:t xml:space="preserve">The key property, from (Nocedal and Wright, 2006), Theorem 3.1: if </w:t>
+        <w:t xml:space="preserve">The key property, from [15], Theorem 3.1: if </w:t>
       </w:r>
       <m:oMath>
         <m:r>
@@ -3455,7 +3465,7 @@
           <w:rFonts w:ascii="Times New Roman" w:hAnsi="Times New Roman"/>
           <w:sz w:val="22"/>
         </w:rPr>
-        <w:t>, the computed Newton step becomes unreliable. We apply Tikhonov regularization (Tikhonov and Arsenin, 1977; Hansen, 1998) to the Hessian block:</w:t>
+        <w:t>, the computed Newton step becomes unreliable. We apply Tikhonov regularization [7, 22] to the Hessian block:</w:t>
       </w:r>
     </w:p>
     <w:p>
@@ -3464,16 +3474,18 @@
         <w:jc w:val="center"/>
       </w:pPr>
       <m:oMath>
-        <m:acc>
-          <m:accPr>
-            <m:chr m:val="̃"/>
-          </m:accPr>
+        <m:limUpp>
           <m:e>
             <m:r>
               <m:t>H</m:t>
             </m:r>
           </m:e>
-        </m:acc>
+          <m:lim>
+            <m:r>
+              <m:t>~</m:t>
+            </m:r>
+          </m:lim>
+        </m:limUpp>
         <m:r>
           <m:t>=H+τI,</m:t>
         </m:r>
@@ -3553,7 +3565,7 @@
                     <m:rPr>
                       <m:nor/>
                     </m:rPr>
-                    <m:t>if </m:t>
+                    <m:t>if </m:t>
                   </m:r>
                   <m:r>
                     <m:t>κ(J)&gt;</m:t>
@@ -3686,7 +3698,7 @@
           <w:rFonts w:ascii="Times New Roman" w:hAnsi="Times New Roman"/>
           <w:sz w:val="22"/>
         </w:rPr>
-        <w:t>This is a Levenberg-Marquardt-type modification (Dennis and Schnabel, 1996) that interpolates between the Newton direction (</w:t>
+        <w:t>This is a Levenberg-Marquardt-type modification [3] that interpolates between the Newton direction (</w:t>
       </w:r>
       <m:oMath>
         <m:r>
@@ -3930,10 +3942,6 @@
               <m:sSup>
                 <m:e>
                   <m:r>
-                    <w:rPr>
-                      <w:sz w:val="18"/>
-                      <w:szCs w:val="18"/>
-                    </w:rPr>
                     <m:t>G</m:t>
                   </m:r>
                 </m:e>
@@ -3944,10 +3952,6 @@
                     </m:dPr>
                     <m:e>
                       <m:r>
-                        <w:rPr>
-                          <w:sz w:val="18"/>
-                          <w:szCs w:val="18"/>
-                        </w:rPr>
                         <m:t>k</m:t>
                       </m:r>
                     </m:e>
@@ -4019,19 +4023,11 @@
             </w:r>
             <m:oMath>
               <m:r>
-                <w:rPr>
-                  <w:sz w:val="18"/>
-                  <w:szCs w:val="18"/>
-                </w:rPr>
                 <m:t>κ(</m:t>
               </m:r>
               <m:sSup>
                 <m:e>
                   <m:r>
-                    <w:rPr>
-                      <w:sz w:val="18"/>
-                      <w:szCs w:val="18"/>
-                    </w:rPr>
                     <m:t>J</m:t>
                   </m:r>
                 </m:e>
@@ -4042,10 +4038,6 @@
                     </m:dPr>
                     <m:e>
                       <m:r>
-                        <w:rPr>
-                          <w:sz w:val="18"/>
-                          <w:szCs w:val="18"/>
-                        </w:rPr>
                         <m:t>k</m:t>
                       </m:r>
                     </m:e>
@@ -4053,10 +4045,6 @@
                 </m:sup>
               </m:sSup>
               <m:r>
-                <w:rPr>
-                  <w:sz w:val="18"/>
-                  <w:szCs w:val="18"/>
-                </w:rPr>
                 <m:t>)</m:t>
               </m:r>
             </m:oMath>
@@ -4126,10 +4114,6 @@
               <m:sSup>
                 <m:e>
                   <m:r>
-                    <w:rPr>
-                      <w:sz w:val="18"/>
-                      <w:szCs w:val="18"/>
-                    </w:rPr>
                     <m:t>α</m:t>
                   </m:r>
                 </m:e>
@@ -4140,10 +4124,6 @@
                     </m:dPr>
                     <m:e>
                       <m:r>
-                        <w:rPr>
-                          <w:sz w:val="18"/>
-                          <w:szCs w:val="18"/>
-                        </w:rPr>
                         <m:t>k</m:t>
                       </m:r>
                     </m:e>
@@ -4543,10 +4523,6 @@
             </w:r>
             <m:oMath>
               <m:r>
-                <w:rPr>
-                  <w:sz w:val="18"/>
-                  <w:szCs w:val="18"/>
-                </w:rPr>
                 <m:t>α</m:t>
               </m:r>
             </m:oMath>
@@ -4628,19 +4604,11 @@
               <m:sSub>
                 <m:e>
                   <m:r>
-                    <w:rPr>
-                      <w:sz w:val="18"/>
-                      <w:szCs w:val="18"/>
-                    </w:rPr>
                     <m:t/>
                   </m:r>
                 </m:e>
                 <m:sub>
                   <m:r>
-                    <w:rPr>
-                      <w:sz w:val="18"/>
-                      <w:szCs w:val="18"/>
-                    </w:rPr>
                     <m:t>4</m:t>
                   </m:r>
                 </m:sub>
@@ -4856,19 +4824,11 @@
               <m:sSub>
                 <m:e>
                   <m:r>
-                    <w:rPr>
-                      <w:sz w:val="18"/>
-                      <w:szCs w:val="18"/>
-                    </w:rPr>
                     <m:t/>
                   </m:r>
                 </m:e>
                 <m:sub>
                   <m:r>
-                    <w:rPr>
-                      <w:sz w:val="18"/>
-                      <w:szCs w:val="18"/>
-                    </w:rPr>
                     <m:t>4</m:t>
                   </m:r>
                 </m:sub>
@@ -5084,19 +5044,11 @@
               <m:sSub>
                 <m:e>
                   <m:r>
-                    <w:rPr>
-                      <w:sz w:val="18"/>
-                      <w:szCs w:val="18"/>
-                    </w:rPr>
                     <m:t/>
                   </m:r>
                 </m:e>
                 <m:sub>
                   <m:r>
-                    <w:rPr>
-                      <w:sz w:val="18"/>
-                      <w:szCs w:val="18"/>
-                    </w:rPr>
                     <m:t>2</m:t>
                   </m:r>
                 </m:sub>
@@ -5112,19 +5064,11 @@
               <m:sSub>
                 <m:e>
                   <m:r>
-                    <w:rPr>
-                      <w:sz w:val="18"/>
-                      <w:szCs w:val="18"/>
-                    </w:rPr>
                     <m:t/>
                   </m:r>
                 </m:e>
                 <m:sub>
                   <m:r>
-                    <w:rPr>
-                      <w:sz w:val="18"/>
-                      <w:szCs w:val="18"/>
-                    </w:rPr>
                     <m:t>2</m:t>
                   </m:r>
                 </m:sub>
@@ -5340,19 +5284,11 @@
               <m:sSub>
                 <m:e>
                   <m:r>
-                    <w:rPr>
-                      <w:sz w:val="18"/>
-                      <w:szCs w:val="18"/>
-                    </w:rPr>
                     <m:t/>
                   </m:r>
                 </m:e>
                 <m:sub>
                   <m:r>
-                    <w:rPr>
-                      <w:sz w:val="18"/>
-                      <w:szCs w:val="18"/>
-                    </w:rPr>
                     <m:t>3</m:t>
                   </m:r>
                 </m:sub>
@@ -6120,28 +6056,16 @@
               <m:sSub>
                 <m:e>
                   <m:r>
-                    <w:rPr>
-                      <w:sz w:val="18"/>
-                      <w:szCs w:val="18"/>
-                    </w:rPr>
                     <m:t>κ</m:t>
                   </m:r>
                 </m:e>
                 <m:sub>
                   <m:r>
-                    <w:rPr>
-                      <w:sz w:val="18"/>
-                      <w:szCs w:val="18"/>
-                    </w:rPr>
                     <m:t>2</m:t>
                   </m:r>
                 </m:sub>
               </m:sSub>
               <m:r>
-                <w:rPr>
-                  <w:sz w:val="18"/>
-                  <w:szCs w:val="18"/>
-                </w:rPr>
                 <m:t>(J)</m:t>
               </m:r>
             </m:oMath>
@@ -6374,10 +6298,6 @@
             </w:r>
             <m:oMath>
               <m:r>
-                <w:rPr>
-                  <w:sz w:val="18"/>
-                  <w:szCs w:val="18"/>
-                </w:rPr>
                 <m:t>α</m:t>
               </m:r>
             </m:oMath>
@@ -6571,46 +6491,26 @@
               <m:sSub>
                 <m:e>
                   <m:r>
-                    <w:rPr>
-                      <w:sz w:val="18"/>
-                      <w:szCs w:val="18"/>
-                    </w:rPr>
                     <m:t>c</m:t>
                   </m:r>
                 </m:e>
                 <m:sub>
                   <m:r>
-                    <w:rPr>
-                      <w:sz w:val="18"/>
-                      <w:szCs w:val="18"/>
-                    </w:rPr>
                     <m:t>1</m:t>
                   </m:r>
                 </m:sub>
               </m:sSub>
               <m:r>
-                <w:rPr>
-                  <w:sz w:val="18"/>
-                  <w:szCs w:val="18"/>
-                </w:rPr>
                 <m:t>=</m:t>
               </m:r>
               <m:sSup>
                 <m:e>
                   <m:r>
-                    <w:rPr>
-                      <w:sz w:val="18"/>
-                      <w:szCs w:val="18"/>
-                    </w:rPr>
                     <m:t>10</m:t>
                   </m:r>
                 </m:e>
                 <m:sup>
                   <m:r>
-                    <w:rPr>
-                      <w:sz w:val="18"/>
-                      <w:szCs w:val="18"/>
-                    </w:rPr>
                     <m:t>−4</m:t>
                   </m:r>
                 </m:sup>
@@ -6624,10 +6524,6 @@
             </w:r>
             <m:oMath>
               <m:r>
-                <w:rPr>
-                  <w:sz w:val="18"/>
-                  <w:szCs w:val="18"/>
-                </w:rPr>
                 <m:t>ρ=0.5</m:t>
               </m:r>
             </m:oMath>
@@ -6641,28 +6537,16 @@
               <m:sSub>
                 <m:e>
                   <m:r>
-                    <w:rPr>
-                      <w:sz w:val="18"/>
-                      <w:szCs w:val="18"/>
-                    </w:rPr>
                     <m:t>K</m:t>
                   </m:r>
                 </m:e>
                 <m:sub>
                   <m:r>
-                    <w:rPr>
-                      <w:sz w:val="18"/>
-                      <w:szCs w:val="18"/>
-                    </w:rPr>
                     <m:t>max</m:t>
                   </m:r>
                 </m:sub>
               </m:sSub>
               <m:r>
-                <w:rPr>
-                  <w:sz w:val="18"/>
-                  <w:szCs w:val="18"/>
-                </w:rPr>
                 <m:t>=20</m:t>
               </m:r>
             </m:oMath>
@@ -6758,10 +6642,6 @@
             </w:r>
             <m:oMath>
               <m:r>
-                <w:rPr>
-                  <w:sz w:val="18"/>
-                  <w:szCs w:val="18"/>
-                </w:rPr>
                 <m:t>α</m:t>
               </m:r>
             </m:oMath>
@@ -6791,46 +6671,26 @@
               <m:sSub>
                 <m:e>
                   <m:r>
-                    <w:rPr>
-                      <w:sz w:val="18"/>
-                      <w:szCs w:val="18"/>
-                    </w:rPr>
                     <m:t>κ</m:t>
                   </m:r>
                 </m:e>
                 <m:sub>
                   <m:r>
-                    <w:rPr>
-                      <w:sz w:val="18"/>
-                      <w:szCs w:val="18"/>
-                    </w:rPr>
                     <m:t>max</m:t>
                   </m:r>
                 </m:sub>
               </m:sSub>
               <m:r>
-                <w:rPr>
-                  <w:sz w:val="18"/>
-                  <w:szCs w:val="18"/>
-                </w:rPr>
                 <m:t>=</m:t>
               </m:r>
               <m:sSup>
                 <m:e>
                   <m:r>
-                    <w:rPr>
-                      <w:sz w:val="18"/>
-                      <w:szCs w:val="18"/>
-                    </w:rPr>
                     <m:t>10</m:t>
                   </m:r>
                 </m:e>
                 <m:sup>
                   <m:r>
-                    <w:rPr>
-                      <w:sz w:val="18"/>
-                      <w:szCs w:val="18"/>
-                    </w:rPr>
                     <m:t>10</m:t>
                   </m:r>
                 </m:sup>
@@ -6846,46 +6706,26 @@
               <m:sSub>
                 <m:e>
                   <m:r>
-                    <w:rPr>
-                      <w:sz w:val="18"/>
-                      <w:szCs w:val="18"/>
-                    </w:rPr>
                     <m:t>τ</m:t>
                   </m:r>
                 </m:e>
                 <m:sub>
                   <m:r>
-                    <w:rPr>
-                      <w:sz w:val="18"/>
-                      <w:szCs w:val="18"/>
-                    </w:rPr>
                     <m:t>0</m:t>
                   </m:r>
                 </m:sub>
               </m:sSub>
               <m:r>
-                <w:rPr>
-                  <w:sz w:val="18"/>
-                  <w:szCs w:val="18"/>
-                </w:rPr>
                 <m:t>=</m:t>
               </m:r>
               <m:sSup>
                 <m:e>
                   <m:r>
-                    <w:rPr>
-                      <w:sz w:val="18"/>
-                      <w:szCs w:val="18"/>
-                    </w:rPr>
                     <m:t>10</m:t>
                   </m:r>
                 </m:e>
                 <m:sup>
                   <m:r>
-                    <w:rPr>
-                      <w:sz w:val="18"/>
-                      <w:szCs w:val="18"/>
-                    </w:rPr>
                     <m:t>−6</m:t>
                   </m:r>
                 </m:sup>
@@ -7039,7 +6879,7 @@
           <w:rFonts w:ascii="Times New Roman" w:hAnsi="Times New Roman"/>
           <w:sz w:val="22"/>
         </w:rPr>
-        <w:t xml:space="preserve">All calculations use the NeqSim library (Solbraa, 2024) version 3.7.0 with: - SRK or SRK-CPA equation of state with the classic (quadratic) mixing rule and binary interaction parameters from the NeqSim database - LU decomposition (EJML library) with pseudo-inverse fallback for singular systems - Component thermodynamic data from the NeqSim database - Convergence tolerance: </w:t>
+        <w:t xml:space="preserve">All calculations use the NeqSim library [14] version 3.7.0 with: - SRK or SRK-CPA equation of state with the classic (quadratic) mixing rule and binary interaction parameters from the NeqSim database - LU decomposition (EJML library) with pseudo-inverse fallback for singular systems - Component thermodynamic data from the NeqSim database - Convergence tolerance: </w:t>
       </w:r>
       <m:oMath>
         <m:r>
@@ -7463,19 +7303,11 @@
               <m:sSub>
                 <m:e>
                   <m:r>
-                    <w:rPr>
-                      <w:sz w:val="18"/>
-                      <w:szCs w:val="18"/>
-                    </w:rPr>
                     <m:t/>
                   </m:r>
                 </m:e>
                 <m:sub>
                   <m:r>
-                    <w:rPr>
-                      <w:sz w:val="18"/>
-                      <w:szCs w:val="18"/>
-                    </w:rPr>
                     <m:t>4</m:t>
                   </m:r>
                 </m:sub>
@@ -7625,19 +7457,11 @@
               <m:sSub>
                 <m:e>
                   <m:r>
-                    <w:rPr>
-                      <w:sz w:val="18"/>
-                      <w:szCs w:val="18"/>
-                    </w:rPr>
                     <m:t/>
                   </m:r>
                 </m:e>
                 <m:sub>
                   <m:r>
-                    <w:rPr>
-                      <w:sz w:val="18"/>
-                      <w:szCs w:val="18"/>
-                    </w:rPr>
                     <m:t>4</m:t>
                   </m:r>
                 </m:sub>
@@ -7787,19 +7611,11 @@
               <m:sSub>
                 <m:e>
                   <m:r>
-                    <w:rPr>
-                      <w:sz w:val="18"/>
-                      <w:szCs w:val="18"/>
-                    </w:rPr>
                     <m:t/>
                   </m:r>
                 </m:e>
                 <m:sub>
                   <m:r>
-                    <w:rPr>
-                      <w:sz w:val="18"/>
-                      <w:szCs w:val="18"/>
-                    </w:rPr>
                     <m:t>2</m:t>
                   </m:r>
                 </m:sub>
@@ -7815,19 +7631,11 @@
               <m:sSub>
                 <m:e>
                   <m:r>
-                    <w:rPr>
-                      <w:sz w:val="18"/>
-                      <w:szCs w:val="18"/>
-                    </w:rPr>
                     <m:t/>
                   </m:r>
                 </m:e>
                 <m:sub>
                   <m:r>
-                    <w:rPr>
-                      <w:sz w:val="18"/>
-                      <w:szCs w:val="18"/>
-                    </w:rPr>
                     <m:t>2</m:t>
                   </m:r>
                 </m:sub>
@@ -7971,19 +7779,11 @@
               <m:sSub>
                 <m:e>
                   <m:r>
-                    <w:rPr>
-                      <w:sz w:val="18"/>
-                      <w:szCs w:val="18"/>
-                    </w:rPr>
                     <m:t/>
                   </m:r>
                 </m:e>
                 <m:sub>
                   <m:r>
-                    <w:rPr>
-                      <w:sz w:val="18"/>
-                      <w:szCs w:val="18"/>
-                    </w:rPr>
                     <m:t>3</m:t>
                   </m:r>
                 </m:sub>
@@ -8761,28 +8561,16 @@
             </w:r>
             <m:oMath>
               <m:r>
-                <w:rPr>
-                  <w:sz w:val="18"/>
-                  <w:szCs w:val="18"/>
-                </w:rPr>
                 <m:t>3.6×</m:t>
               </m:r>
               <m:sSup>
                 <m:e>
                   <m:r>
-                    <w:rPr>
-                      <w:sz w:val="18"/>
-                      <w:szCs w:val="18"/>
-                    </w:rPr>
                     <m:t>10</m:t>
                   </m:r>
                 </m:e>
                 <m:sup>
                   <m:r>
-                    <w:rPr>
-                      <w:sz w:val="18"/>
-                      <w:szCs w:val="18"/>
-                    </w:rPr>
                     <m:t>−5</m:t>
                   </m:r>
                 </m:sup>
@@ -8806,28 +8594,16 @@
             </w:r>
             <m:oMath>
               <m:r>
-                <w:rPr>
-                  <w:sz w:val="18"/>
-                  <w:szCs w:val="18"/>
-                </w:rPr>
                 <m:t>1.7×</m:t>
               </m:r>
               <m:sSup>
                 <m:e>
                   <m:r>
-                    <w:rPr>
-                      <w:sz w:val="18"/>
-                      <w:szCs w:val="18"/>
-                    </w:rPr>
                     <m:t>10</m:t>
                   </m:r>
                 </m:e>
                 <m:sup>
                   <m:r>
-                    <w:rPr>
-                      <w:sz w:val="18"/>
-                      <w:szCs w:val="18"/>
-                    </w:rPr>
                     <m:t>−15</m:t>
                   </m:r>
                 </m:sup>
@@ -8851,10 +8627,6 @@
             </w:r>
             <m:oMath>
               <m:r>
-                <w:rPr>
-                  <w:sz w:val="18"/>
-                  <w:szCs w:val="18"/>
-                </w:rPr>
                 <m:t>0</m:t>
               </m:r>
             </m:oMath>
@@ -8876,28 +8648,16 @@
             </w:r>
             <m:oMath>
               <m:r>
-                <w:rPr>
-                  <w:sz w:val="18"/>
-                  <w:szCs w:val="18"/>
-                </w:rPr>
                 <m:t>3.6×</m:t>
               </m:r>
               <m:sSup>
                 <m:e>
                   <m:r>
-                    <w:rPr>
-                      <w:sz w:val="18"/>
-                      <w:szCs w:val="18"/>
-                    </w:rPr>
                     <m:t>10</m:t>
                   </m:r>
                 </m:e>
                 <m:sup>
                   <m:r>
-                    <w:rPr>
-                      <w:sz w:val="18"/>
-                      <w:szCs w:val="18"/>
-                    </w:rPr>
                     <m:t>−5</m:t>
                   </m:r>
                 </m:sup>
@@ -8945,28 +8705,16 @@
             </w:r>
             <m:oMath>
               <m:r>
-                <w:rPr>
-                  <w:sz w:val="18"/>
-                  <w:szCs w:val="18"/>
-                </w:rPr>
                 <m:t>3.2×</m:t>
               </m:r>
               <m:sSup>
                 <m:e>
                   <m:r>
-                    <w:rPr>
-                      <w:sz w:val="18"/>
-                      <w:szCs w:val="18"/>
-                    </w:rPr>
                     <m:t>10</m:t>
                   </m:r>
                 </m:e>
                 <m:sup>
                   <m:r>
-                    <w:rPr>
-                      <w:sz w:val="18"/>
-                      <w:szCs w:val="18"/>
-                    </w:rPr>
                     <m:t>−5</m:t>
                   </m:r>
                 </m:sup>
@@ -8990,28 +8738,16 @@
             </w:r>
             <m:oMath>
               <m:r>
-                <w:rPr>
-                  <w:sz w:val="18"/>
-                  <w:szCs w:val="18"/>
-                </w:rPr>
                 <m:t>8.6×</m:t>
               </m:r>
               <m:sSup>
                 <m:e>
                   <m:r>
-                    <w:rPr>
-                      <w:sz w:val="18"/>
-                      <w:szCs w:val="18"/>
-                    </w:rPr>
                     <m:t>10</m:t>
                   </m:r>
                 </m:e>
                 <m:sup>
                   <m:r>
-                    <w:rPr>
-                      <w:sz w:val="18"/>
-                      <w:szCs w:val="18"/>
-                    </w:rPr>
                     <m:t>−15</m:t>
                   </m:r>
                 </m:sup>
@@ -9035,10 +8771,6 @@
             </w:r>
             <m:oMath>
               <m:r>
-                <w:rPr>
-                  <w:sz w:val="18"/>
-                  <w:szCs w:val="18"/>
-                </w:rPr>
                 <m:t>0</m:t>
               </m:r>
             </m:oMath>
@@ -9060,28 +8792,16 @@
             </w:r>
             <m:oMath>
               <m:r>
-                <w:rPr>
-                  <w:sz w:val="18"/>
-                  <w:szCs w:val="18"/>
-                </w:rPr>
                 <m:t>3.2×</m:t>
               </m:r>
               <m:sSup>
                 <m:e>
                   <m:r>
-                    <w:rPr>
-                      <w:sz w:val="18"/>
-                      <w:szCs w:val="18"/>
-                    </w:rPr>
                     <m:t>10</m:t>
                   </m:r>
                 </m:e>
                 <m:sup>
                   <m:r>
-                    <w:rPr>
-                      <w:sz w:val="18"/>
-                      <w:szCs w:val="18"/>
-                    </w:rPr>
                     <m:t>−5</m:t>
                   </m:r>
                 </m:sup>
@@ -9129,28 +8849,16 @@
             </w:r>
             <m:oMath>
               <m:r>
-                <w:rPr>
-                  <w:sz w:val="18"/>
-                  <w:szCs w:val="18"/>
-                </w:rPr>
                 <m:t>2.5×</m:t>
               </m:r>
               <m:sSup>
                 <m:e>
                   <m:r>
-                    <w:rPr>
-                      <w:sz w:val="18"/>
-                      <w:szCs w:val="18"/>
-                    </w:rPr>
                     <m:t>10</m:t>
                   </m:r>
                 </m:e>
                 <m:sup>
                   <m:r>
-                    <w:rPr>
-                      <w:sz w:val="18"/>
-                      <w:szCs w:val="18"/>
-                    </w:rPr>
                     <m:t>−5</m:t>
                   </m:r>
                 </m:sup>
@@ -9174,28 +8882,16 @@
             </w:r>
             <m:oMath>
               <m:r>
-                <w:rPr>
-                  <w:sz w:val="18"/>
-                  <w:szCs w:val="18"/>
-                </w:rPr>
                 <m:t>1.1×</m:t>
               </m:r>
               <m:sSup>
                 <m:e>
                   <m:r>
-                    <w:rPr>
-                      <w:sz w:val="18"/>
-                      <w:szCs w:val="18"/>
-                    </w:rPr>
                     <m:t>10</m:t>
                   </m:r>
                 </m:e>
                 <m:sup>
                   <m:r>
-                    <w:rPr>
-                      <w:sz w:val="18"/>
-                      <w:szCs w:val="18"/>
-                    </w:rPr>
                     <m:t>−16</m:t>
                   </m:r>
                 </m:sup>
@@ -9219,10 +8915,6 @@
             </w:r>
             <m:oMath>
               <m:r>
-                <w:rPr>
-                  <w:sz w:val="18"/>
-                  <w:szCs w:val="18"/>
-                </w:rPr>
                 <m:t>0</m:t>
               </m:r>
             </m:oMath>
@@ -9244,28 +8936,16 @@
             </w:r>
             <m:oMath>
               <m:r>
-                <w:rPr>
-                  <w:sz w:val="18"/>
-                  <w:szCs w:val="18"/>
-                </w:rPr>
                 <m:t>2.5×</m:t>
               </m:r>
               <m:sSup>
                 <m:e>
                   <m:r>
-                    <w:rPr>
-                      <w:sz w:val="18"/>
-                      <w:szCs w:val="18"/>
-                    </w:rPr>
                     <m:t>10</m:t>
                   </m:r>
                 </m:e>
                 <m:sup>
                   <m:r>
-                    <w:rPr>
-                      <w:sz w:val="18"/>
-                      <w:szCs w:val="18"/>
-                    </w:rPr>
                     <m:t>−5</m:t>
                   </m:r>
                 </m:sup>
@@ -9313,28 +8993,16 @@
             </w:r>
             <m:oMath>
               <m:r>
-                <w:rPr>
-                  <w:sz w:val="18"/>
-                  <w:szCs w:val="18"/>
-                </w:rPr>
                 <m:t>9.4×</m:t>
               </m:r>
               <m:sSup>
                 <m:e>
                   <m:r>
-                    <w:rPr>
-                      <w:sz w:val="18"/>
-                      <w:szCs w:val="18"/>
-                    </w:rPr>
                     <m:t>10</m:t>
                   </m:r>
                 </m:e>
                 <m:sup>
                   <m:r>
-                    <w:rPr>
-                      <w:sz w:val="18"/>
-                      <w:szCs w:val="18"/>
-                    </w:rPr>
                     <m:t>−7</m:t>
                   </m:r>
                 </m:sup>
@@ -9358,10 +9026,6 @@
             </w:r>
             <m:oMath>
               <m:r>
-                <w:rPr>
-                  <w:sz w:val="18"/>
-                  <w:szCs w:val="18"/>
-                </w:rPr>
                 <m:t>0</m:t>
               </m:r>
             </m:oMath>
@@ -9383,10 +9047,6 @@
             </w:r>
             <m:oMath>
               <m:r>
-                <w:rPr>
-                  <w:sz w:val="18"/>
-                  <w:szCs w:val="18"/>
-                </w:rPr>
                 <m:t>0</m:t>
               </m:r>
             </m:oMath>
@@ -9408,28 +9068,16 @@
             </w:r>
             <m:oMath>
               <m:r>
-                <w:rPr>
-                  <w:sz w:val="18"/>
-                  <w:szCs w:val="18"/>
-                </w:rPr>
                 <m:t>9.4×</m:t>
               </m:r>
               <m:sSup>
                 <m:e>
                   <m:r>
-                    <w:rPr>
-                      <w:sz w:val="18"/>
-                      <w:szCs w:val="18"/>
-                    </w:rPr>
                     <m:t>10</m:t>
                   </m:r>
                 </m:e>
                 <m:sup>
                   <m:r>
-                    <w:rPr>
-                      <w:sz w:val="18"/>
-                      <w:szCs w:val="18"/>
-                    </w:rPr>
                     <m:t>−7</m:t>
                   </m:r>
                 </m:sup>
@@ -9483,28 +9131,16 @@
             </w:r>
             <m:oMath>
               <m:r>
-                <w:rPr>
-                  <w:sz w:val="18"/>
-                  <w:szCs w:val="18"/>
-                </w:rPr>
                 <m:t>1.7×</m:t>
               </m:r>
               <m:sSup>
                 <m:e>
                   <m:r>
-                    <w:rPr>
-                      <w:sz w:val="18"/>
-                      <w:szCs w:val="18"/>
-                    </w:rPr>
                     <m:t>10</m:t>
                   </m:r>
                 </m:e>
                 <m:sup>
                   <m:r>
-                    <w:rPr>
-                      <w:sz w:val="18"/>
-                      <w:szCs w:val="18"/>
-                    </w:rPr>
                     <m:t>−10</m:t>
                   </m:r>
                 </m:sup>
@@ -9531,10 +9167,6 @@
             </w:r>
             <m:oMath>
               <m:r>
-                <w:rPr>
-                  <w:sz w:val="18"/>
-                  <w:szCs w:val="18"/>
-                </w:rPr>
                 <m:t>0</m:t>
               </m:r>
             </m:oMath>
@@ -9559,10 +9191,6 @@
             </w:r>
             <m:oMath>
               <m:r>
-                <w:rPr>
-                  <w:sz w:val="18"/>
-                  <w:szCs w:val="18"/>
-                </w:rPr>
                 <m:t>0</m:t>
               </m:r>
             </m:oMath>
@@ -9587,28 +9215,16 @@
             </w:r>
             <m:oMath>
               <m:r>
-                <w:rPr>
-                  <w:sz w:val="18"/>
-                  <w:szCs w:val="18"/>
-                </w:rPr>
                 <m:t>1.7×</m:t>
               </m:r>
               <m:sSup>
                 <m:e>
                   <m:r>
-                    <w:rPr>
-                      <w:sz w:val="18"/>
-                      <w:szCs w:val="18"/>
-                    </w:rPr>
                     <m:t>10</m:t>
                   </m:r>
                 </m:e>
                 <m:sup>
                   <m:r>
-                    <w:rPr>
-                      <w:sz w:val="18"/>
-                      <w:szCs w:val="18"/>
-                    </w:rPr>
                     <m:t>−10</m:t>
                   </m:r>
                 </m:sup>
@@ -11224,10 +10840,6 @@
             </w:r>
             <m:oMath>
               <m:r>
-                <w:rPr>
-                  <w:sz w:val="18"/>
-                  <w:szCs w:val="18"/>
-                </w:rPr>
                 <m:t>26.1±25.7</m:t>
               </m:r>
             </m:oMath>
@@ -11249,10 +10861,6 @@
             </w:r>
             <m:oMath>
               <m:r>
-                <w:rPr>
-                  <w:sz w:val="18"/>
-                  <w:szCs w:val="18"/>
-                </w:rPr>
                 <m:t>5.3±0.9</m:t>
               </m:r>
             </m:oMath>
@@ -11274,10 +10882,6 @@
             </w:r>
             <m:oMath>
               <m:r>
-                <w:rPr>
-                  <w:sz w:val="18"/>
-                  <w:szCs w:val="18"/>
-                </w:rPr>
                 <m:t>6.0±0.8</m:t>
               </m:r>
             </m:oMath>
@@ -11299,10 +10903,6 @@
             </w:r>
             <m:oMath>
               <m:r>
-                <w:rPr>
-                  <w:sz w:val="18"/>
-                  <w:szCs w:val="18"/>
-                </w:rPr>
                 <m:t>5.2±0.8</m:t>
               </m:r>
             </m:oMath>
@@ -11324,10 +10924,6 @@
             </w:r>
             <m:oMath>
               <m:r>
-                <w:rPr>
-                  <w:sz w:val="18"/>
-                  <w:szCs w:val="18"/>
-                </w:rPr>
                 <m:t>16.0±2.0</m:t>
               </m:r>
             </m:oMath>
@@ -11373,10 +10969,6 @@
             </w:r>
             <m:oMath>
               <m:r>
-                <w:rPr>
-                  <w:sz w:val="18"/>
-                  <w:szCs w:val="18"/>
-                </w:rPr>
                 <m:t>4.7±0.6</m:t>
               </m:r>
             </m:oMath>
@@ -11398,10 +10990,6 @@
             </w:r>
             <m:oMath>
               <m:r>
-                <w:rPr>
-                  <w:sz w:val="18"/>
-                  <w:szCs w:val="18"/>
-                </w:rPr>
                 <m:t>3.4±0.4</m:t>
               </m:r>
             </m:oMath>
@@ -11423,10 +11011,6 @@
             </w:r>
             <m:oMath>
               <m:r>
-                <w:rPr>
-                  <w:sz w:val="18"/>
-                  <w:szCs w:val="18"/>
-                </w:rPr>
                 <m:t>4.9±1.2</m:t>
               </m:r>
             </m:oMath>
@@ -11448,10 +11032,6 @@
             </w:r>
             <m:oMath>
               <m:r>
-                <w:rPr>
-                  <w:sz w:val="18"/>
-                  <w:szCs w:val="18"/>
-                </w:rPr>
                 <m:t>3.2±0.2</m:t>
               </m:r>
             </m:oMath>
@@ -11473,10 +11053,6 @@
             </w:r>
             <m:oMath>
               <m:r>
-                <w:rPr>
-                  <w:sz w:val="18"/>
-                  <w:szCs w:val="18"/>
-                </w:rPr>
                 <m:t>12.1±0.3</m:t>
               </m:r>
             </m:oMath>
@@ -11522,10 +11098,6 @@
             </w:r>
             <m:oMath>
               <m:r>
-                <w:rPr>
-                  <w:sz w:val="18"/>
-                  <w:szCs w:val="18"/>
-                </w:rPr>
                 <m:t>4.6±4.1</m:t>
               </m:r>
             </m:oMath>
@@ -11547,10 +11119,6 @@
             </w:r>
             <m:oMath>
               <m:r>
-                <w:rPr>
-                  <w:sz w:val="18"/>
-                  <w:szCs w:val="18"/>
-                </w:rPr>
                 <m:t>1.8±0.2</m:t>
               </m:r>
             </m:oMath>
@@ -11572,10 +11140,6 @@
             </w:r>
             <m:oMath>
               <m:r>
-                <w:rPr>
-                  <w:sz w:val="18"/>
-                  <w:szCs w:val="18"/>
-                </w:rPr>
                 <m:t>2.7±0.2</m:t>
               </m:r>
             </m:oMath>
@@ -11597,10 +11161,6 @@
             </w:r>
             <m:oMath>
               <m:r>
-                <w:rPr>
-                  <w:sz w:val="18"/>
-                  <w:szCs w:val="18"/>
-                </w:rPr>
                 <m:t>2.1±0.4</m:t>
               </m:r>
             </m:oMath>
@@ -11622,10 +11182,6 @@
             </w:r>
             <m:oMath>
               <m:r>
-                <w:rPr>
-                  <w:sz w:val="18"/>
-                  <w:szCs w:val="18"/>
-                </w:rPr>
                 <m:t>6.8±1.1</m:t>
               </m:r>
             </m:oMath>
@@ -11671,10 +11227,6 @@
             </w:r>
             <m:oMath>
               <m:r>
-                <w:rPr>
-                  <w:sz w:val="18"/>
-                  <w:szCs w:val="18"/>
-                </w:rPr>
                 <m:t>5.3±1.6</m:t>
               </m:r>
             </m:oMath>
@@ -11696,10 +11248,6 @@
             </w:r>
             <m:oMath>
               <m:r>
-                <w:rPr>
-                  <w:sz w:val="18"/>
-                  <w:szCs w:val="18"/>
-                </w:rPr>
                 <m:t>1.2±0.1</m:t>
               </m:r>
             </m:oMath>
@@ -11721,10 +11269,6 @@
             </w:r>
             <m:oMath>
               <m:r>
-                <w:rPr>
-                  <w:sz w:val="18"/>
-                  <w:szCs w:val="18"/>
-                </w:rPr>
                 <m:t>5.0±1.1</m:t>
               </m:r>
             </m:oMath>
@@ -11746,10 +11290,6 @@
             </w:r>
             <m:oMath>
               <m:r>
-                <w:rPr>
-                  <w:sz w:val="18"/>
-                  <w:szCs w:val="18"/>
-                </w:rPr>
                 <m:t>3.6±0.3</m:t>
               </m:r>
             </m:oMath>
@@ -11771,10 +11311,6 @@
             </w:r>
             <m:oMath>
               <m:r>
-                <w:rPr>
-                  <w:sz w:val="18"/>
-                  <w:szCs w:val="18"/>
-                </w:rPr>
                 <m:t>2.1±0.4</m:t>
               </m:r>
             </m:oMath>
@@ -11826,10 +11362,6 @@
             </w:r>
             <m:oMath>
               <m:r>
-                <w:rPr>
-                  <w:sz w:val="18"/>
-                  <w:szCs w:val="18"/>
-                </w:rPr>
                 <m:t>112.7±49.5</m:t>
               </m:r>
             </m:oMath>
@@ -11854,10 +11386,6 @@
             </w:r>
             <m:oMath>
               <m:r>
-                <w:rPr>
-                  <w:sz w:val="18"/>
-                  <w:szCs w:val="18"/>
-                </w:rPr>
                 <m:t>10.0±11.9</m:t>
               </m:r>
             </m:oMath>
@@ -11882,10 +11410,6 @@
             </w:r>
             <m:oMath>
               <m:r>
-                <w:rPr>
-                  <w:sz w:val="18"/>
-                  <w:szCs w:val="18"/>
-                </w:rPr>
                 <m:t>92.4±9.7</m:t>
               </m:r>
             </m:oMath>
@@ -11910,10 +11434,6 @@
             </w:r>
             <m:oMath>
               <m:r>
-                <w:rPr>
-                  <w:sz w:val="18"/>
-                  <w:szCs w:val="18"/>
-                </w:rPr>
                 <m:t>59.2±5.0</m:t>
               </m:r>
             </m:oMath>
@@ -11938,10 +11458,6 @@
             </w:r>
             <m:oMath>
               <m:r>
-                <w:rPr>
-                  <w:sz w:val="18"/>
-                  <w:szCs w:val="18"/>
-                </w:rPr>
                 <m:t>15.5±0.6</m:t>
               </m:r>
             </m:oMath>
@@ -12349,16 +11865,14 @@
         <w:t xml:space="preserve">Figure 5 shows the element balance error </w:t>
       </w:r>
       <m:oMath>
+        <m:r>
+          <m:t>‖An−b</m:t>
+        </m:r>
         <m:sSub>
           <m:e>
-            <m:d>
-              <m:dPr>
-                <m:begChr m:val="‖"/>
-                <m:sepChr m:val=""/>
-                <m:endChr m:val="‖"/>
-              </m:dPr>
-              <m:e/>
-            </m:d>
+            <m:r>
+              <m:t>‖</m:t>
+            </m:r>
           </m:e>
           <m:sub>
             <m:r>
@@ -12512,7 +12026,41 @@
           <w:b/>
           <w:sz w:val="22"/>
         </w:rPr>
-        <w:t>S4 (NH$_3$, 300 bar):</w:t>
+      </w:r>
+      <w:r>
+        <w:rPr>
+          <w:rFonts w:ascii="Times New Roman" w:hAnsi="Times New Roman"/>
+          <w:sz w:val="22"/>
+        </w:rPr>
+        <w:t>S4 (NH</w:t>
+      </w:r>
+      <m:oMath>
+        <m:sSub>
+          <m:e>
+            <m:r>
+              <m:t/>
+            </m:r>
+          </m:e>
+          <m:sub>
+            <m:r>
+              <m:t>3</m:t>
+            </m:r>
+          </m:sub>
+        </m:sSub>
+      </m:oMath>
+      <w:r>
+        <w:rPr>
+          <w:rFonts w:ascii="Times New Roman" w:hAnsi="Times New Roman"/>
+          <w:sz w:val="22"/>
+        </w:rPr>
+        <w:t>, 300 bar):</w:t>
+      </w:r>
+      <w:r>
+        <w:rPr>
+          <w:rFonts w:ascii="Times New Roman" w:hAnsi="Times New Roman"/>
+          <w:b/>
+          <w:sz w:val="22"/>
+        </w:rPr>
       </w:r>
       <w:r>
         <w:rPr>
@@ -12811,7 +12359,7 @@
           <w:rFonts w:ascii="Times New Roman" w:hAnsi="Times New Roman"/>
           <w:sz w:val="22"/>
         </w:rPr>
-        <w:t>) by allowing step sizes proportional to the current composition change magnitude, rather than using a fixed conservative factor. This is consistent with the design of the NASA CEA algorithm (Gordon and McBride, 1994), which uses similar adaptive step limiting in the log-mole formulation.</w:t>
+        <w:t>) by allowing step sizes proportional to the current composition change magnitude, rather than using a fixed conservative factor. This is consistent with the design of the NASA CEA algorithm [5], which uses similar adaptive step limiting in the log-mole formulation.</w:t>
       </w:r>
     </w:p>
     <w:p>
@@ -13514,7 +13062,7 @@
           <w:rFonts w:ascii="Times New Roman" w:hAnsi="Times New Roman"/>
           <w:sz w:val="22"/>
         </w:rPr>
-        <w:t>Testing is limited to single-phase chemical equilibrium; multiphase equilibrium requires additional phase stability analysis (Michelsen and Mollerup, 2007).</w:t>
+        <w:t>Testing is limited to single-phase chemical equilibrium; multiphase equilibrium requires additional phase stability analysis [13].</w:t>
       </w:r>
     </w:p>
     <w:p>
@@ -13788,7 +13336,7 @@
           <w:rFonts w:ascii="Times New Roman" w:hAnsi="Times New Roman"/>
           <w:sz w:val="22"/>
         </w:rPr>
-        <w:t>Systematic comparison with the RAND method (Tsanas et al., 2018) and element potential methods (Reynolds, 1986)</w:t>
+        <w:t>Systematic comparison with the RAND method [23] and element potential methods [18]</w:t>
       </w:r>
     </w:p>
     <w:p>
@@ -13858,7 +13406,7 @@
           <w:rFonts w:ascii="Times New Roman" w:hAnsi="Times New Roman"/>
           <w:sz w:val="18"/>
         </w:rPr>
-        <w:t>Armijo, L. (1966).  Minimization of Functions Having Lipschitz Continuous First Partial Derivatives.  Pacific J. Math., 16, 1--3.</w:t>
+        <w:t>[1]  Armijo, L. (1966).  Minimization of Functions Having {Lipschitz.  Pacific J. Math., 16, 1--3.</w:t>
       </w:r>
     </w:p>
     <w:p>
@@ -13871,7 +13419,7 @@
           <w:rFonts w:ascii="Times New Roman" w:hAnsi="Times New Roman"/>
           <w:sz w:val="18"/>
         </w:rPr>
-        <w:t>Castier, M. (2009).  Solution of the Isochoric-Isoenergetic Flash Problem by Direct Entropy Maximization.  Fluid Phase Equilib., 276, 7--17.</w:t>
+        <w:t>[2]  Castier, M. (2009).  Solution of the Isochoric-Isoenergetic Flash Problem by Direct Entropy Maximization.  Fluid Phase Equilib., 276, 7--17.</w:t>
       </w:r>
     </w:p>
     <w:p>
@@ -13884,7 +13432,7 @@
           <w:rFonts w:ascii="Times New Roman" w:hAnsi="Times New Roman"/>
           <w:sz w:val="18"/>
         </w:rPr>
-        <w:t>Dennis, J. E. and Schnabel, R. B. (1996).  Numerical Methods for Unconstrained Optimization and Nonlinear Equations.  SIAM.</w:t>
+        <w:t>[3]  Dennis, J. E. and Schnabel, R. B. (1996).  Numerical Methods for Unconstrained Optimization and Nonlinear Equations.  SIAM.</w:t>
       </w:r>
     </w:p>
     <w:p>
@@ -13897,7 +13445,7 @@
           <w:rFonts w:ascii="Times New Roman" w:hAnsi="Times New Roman"/>
           <w:sz w:val="18"/>
         </w:rPr>
-        <w:t>Eriksson, G. (1971).  Thermodynamic Studies of High Temperature Equilibria. III. SOLGAS, a Computer Program for Calculating the Composition and Heat Condition of an Equilibrium Mixture.  Acta Chem. Scand., 25, 2651--2658.</w:t>
+        <w:t>[4]  Eriksson, G. (1971).  Thermodynamic Studies of High Temperature Equilibria. {III.  Acta Chem. Scand., 25, 2651--2658.</w:t>
       </w:r>
     </w:p>
     <w:p>
@@ -13910,7 +13458,7 @@
           <w:rFonts w:ascii="Times New Roman" w:hAnsi="Times New Roman"/>
           <w:sz w:val="18"/>
         </w:rPr>
-        <w:t>Gordon, S. and McBride, B. J. (1994).  Computer Program for Calculation of Complex Chemical Equilibrium Compositions and Applications I. Analysis.</w:t>
+        <w:t>[5]  Gordon, S. and McBride, B. J. (1994).  Computer Program for Calculation of Complex Chemical Equilibrium Compositions and Applications {I.</w:t>
       </w:r>
     </w:p>
     <w:p>
@@ -13923,7 +13471,7 @@
           <w:rFonts w:ascii="Times New Roman" w:hAnsi="Times New Roman"/>
           <w:sz w:val="18"/>
         </w:rPr>
-        <w:t>Greiner, H. (1991).  An Efficient Implementation of Newton's Method for Complex Nonideal Chemical Equilibria.  Comput. Chem. Eng., 15, 115--123.</w:t>
+        <w:t>[6]  Greiner, H. (1991).  An Efficient Implementation of {Newton's.  Comput. Chem. Eng., 15, 115--123.</w:t>
       </w:r>
     </w:p>
     <w:p>
@@ -13936,7 +13484,7 @@
           <w:rFonts w:ascii="Times New Roman" w:hAnsi="Times New Roman"/>
           <w:sz w:val="18"/>
         </w:rPr>
-        <w:t>Hansen, P. C. (1998).  Rank-Deficient and Discrete Ill-Posed Problems: Numerical Aspects of Linear Inversion.  SIAM.</w:t>
+        <w:t>[7]  Hansen, P. C. (1998).  Rank-Deficient and Discrete Ill-Posed Problems: Numerical Aspects of Linear Inversion.  SIAM.</w:t>
       </w:r>
     </w:p>
     <w:p>
@@ -13949,7 +13497,7 @@
           <w:rFonts w:ascii="Times New Roman" w:hAnsi="Times New Roman"/>
           <w:sz w:val="18"/>
         </w:rPr>
-        <w:t>Koukkari, P. and Pajarre, R. (2006).  Calculation of Constrained Equilibria by Gibbs Energy Minimization.  Calphad, 30, 18--26.</w:t>
+        <w:t>[8]  Koukkari, P. and Pajarre, R. (2006).  Calculation of Constrained Equilibria by {Gibbs.  Calphad, 30, 18--26.</w:t>
       </w:r>
     </w:p>
     <w:p>
@@ -13962,7 +13510,7 @@
           <w:rFonts w:ascii="Times New Roman" w:hAnsi="Times New Roman"/>
           <w:sz w:val="18"/>
         </w:rPr>
-        <w:t>Leal, A. M. M. and Kulik, D. A. and Kosakowski, G. (2016).  Computational Methods for Reactive Transport Modeling: An Extended Law of Mass-Action, xLMA, Method for Multiphase Equilibrium Calculations.  Adv. Water Resour., 96, 405--422.</w:t>
+        <w:t>[9]  Leal, A. M. M. and Kulik, D. A. and Kosakowski, G. (2016).  Computational Methods for Reactive Transport Modeling: An Extended Law of Mass-Action, {xLMA.  Adv. Water Resour., 96, 405--422.</w:t>
       </w:r>
     </w:p>
     <w:p>
@@ -13975,7 +13523,7 @@
           <w:rFonts w:ascii="Times New Roman" w:hAnsi="Times New Roman"/>
           <w:sz w:val="18"/>
         </w:rPr>
-        <w:t>McBride, B. J. and Gordon, S. (1996).  Computer Program for Calculation of Complex Chemical Equilibrium Compositions and Applications II. Users Manual and Program Description.</w:t>
+        <w:t>[10]  McBride, B. J. and Gordon, S. (1996).  Computer Program for Calculation of Complex Chemical Equilibrium Compositions and Applications {II.</w:t>
       </w:r>
     </w:p>
     <w:p>
@@ -13988,7 +13536,7 @@
           <w:rFonts w:ascii="Times New Roman" w:hAnsi="Times New Roman"/>
           <w:sz w:val="18"/>
         </w:rPr>
-        <w:t>Michelsen, M. L. (1982).  The Isothermal Flash Problem. Part I. Stability.  Fluid Phase Equilib., 9, 1--19.</w:t>
+        <w:t>[11]  Michelsen, M. L. (1982).  The Isothermal Flash Problem. {Part I.  Fluid Phase Equilib., 9, 1--19.</w:t>
       </w:r>
     </w:p>
     <w:p>
@@ -14001,7 +13549,7 @@
           <w:rFonts w:ascii="Times New Roman" w:hAnsi="Times New Roman"/>
           <w:sz w:val="18"/>
         </w:rPr>
-        <w:t>Michelsen, Michael L. (1982).  The isothermal flash problem. Part II. Phase-split calculation.  Fluid Phase Equilibria, 9, 21--40.</w:t>
+        <w:t>[12]  Michelsen, Michael L. (1982).  The isothermal flash problem. Part II. Phase-split calculation.  Fluid Phase Equilibria, 9, 21--40.</w:t>
       </w:r>
     </w:p>
     <w:p>
@@ -14014,7 +13562,7 @@
           <w:rFonts w:ascii="Times New Roman" w:hAnsi="Times New Roman"/>
           <w:sz w:val="18"/>
         </w:rPr>
-        <w:t>Michelsen, M. L. and Mollerup, J. M. (2007).  Thermodynamic Models: Fundamentals &amp; Computational Aspects.  Tie-Line Publications.</w:t>
+        <w:t>[13]  Michelsen, M. L. and Mollerup, J. M. (2007).  Thermodynamic Models: Fundamentals \&amp; Computational Aspects.  Tie-Line Publications.</w:t>
       </w:r>
     </w:p>
     <w:p>
@@ -14027,7 +13575,7 @@
           <w:rFonts w:ascii="Times New Roman" w:hAnsi="Times New Roman"/>
           <w:sz w:val="18"/>
         </w:rPr>
-        <w:t>Solbraa, Even (2024).  NeqSim: Non-Equilibrium Simulator.</w:t>
+        <w:t>[14]  Solbraa, Even (2024).  {NeqSim.</w:t>
       </w:r>
     </w:p>
     <w:p>
@@ -14040,7 +13588,7 @@
           <w:rFonts w:ascii="Times New Roman" w:hAnsi="Times New Roman"/>
           <w:sz w:val="18"/>
         </w:rPr>
-        <w:t>Nocedal, J. and Wright, S. J. (2006).  Numerical Optimization.  Springer.</w:t>
+        <w:t>[15]  Nocedal, J. and Wright, S. J. (2006).  Numerical Optimization.  Springer.</w:t>
       </w:r>
     </w:p>
     <w:p>
@@ -14053,7 +13601,7 @@
           <w:rFonts w:ascii="Times New Roman" w:hAnsi="Times New Roman"/>
           <w:sz w:val="18"/>
         </w:rPr>
-        <w:t>Peng, D.-Y. and Robinson, D. B. (1976).  A New Two-Constant Equation of State.  Ind. Eng. Chem. Fundam., 15, 59--64.</w:t>
+        <w:t>[16]  Peng, D.-Y. and Robinson, D. B. (1976).  A New Two-Constant Equation of State.  Ind. Eng. Chem. Fundam., 15, 59--64.</w:t>
       </w:r>
     </w:p>
     <w:p>
@@ -14066,7 +13614,7 @@
           <w:rFonts w:ascii="Times New Roman" w:hAnsi="Times New Roman"/>
           <w:sz w:val="18"/>
         </w:rPr>
-        <w:t>Rachford, H. H. and Rice, J. D. (1952).  Procedure for use of electronic digital computers in calculating flash vaporization hydrocarbon equilibrium.  Journal of Petroleum Technology, 4, 19.</w:t>
+        <w:t>[17]  Rachford, H. H. and Rice, J. D. (1952).  Procedure for use of electronic digital computers in calculating flash vaporization hydrocarbon equilibrium.  Journal of Petroleum Technology, 4, 19.</w:t>
       </w:r>
     </w:p>
     <w:p>
@@ -14079,7 +13627,7 @@
           <w:rFonts w:ascii="Times New Roman" w:hAnsi="Times New Roman"/>
           <w:sz w:val="18"/>
         </w:rPr>
-        <w:t>Reynolds, W. C. (1986).  The Element Potential Method for Chemical Equilibrium Analysis: Implementation in the Interactive Program STANJAN.</w:t>
+        <w:t>[18]  Reynolds, W. C. (1986).  The Element Potential Method for Chemical Equilibrium Analysis: Implementation in the Interactive Program {STANJAN.</w:t>
       </w:r>
     </w:p>
     <w:p>
@@ -14092,7 +13640,7 @@
           <w:rFonts w:ascii="Times New Roman" w:hAnsi="Times New Roman"/>
           <w:sz w:val="18"/>
         </w:rPr>
-        <w:t>Smith, W. R. and Missen, R. W. (1982).  Chemical Reaction Equilibrium Analysis: Theory and Algorithms.  Wiley-Interscience.</w:t>
+        <w:t>[19]  Smith, W. R. and Missen, R. W. (1982).  Chemical Reaction Equilibrium Analysis: Theory and Algorithms.  Wiley-Interscience.</w:t>
       </w:r>
     </w:p>
     <w:p>
@@ -14105,7 +13653,7 @@
           <w:rFonts w:ascii="Times New Roman" w:hAnsi="Times New Roman"/>
           <w:sz w:val="18"/>
         </w:rPr>
-        <w:t>Smith, J. M. and Van Ness, H. C. and Abbott, M. M. (2005).  Introduction to Chemical Engineering Thermodynamics.  McGraw-Hill.</w:t>
+        <w:t>[20]  Smith, J. M. and Van Ness, H. C. and Abbott, M. M. (2005).  Introduction to Chemical Engineering Thermodynamics.  McGraw-Hill.</w:t>
       </w:r>
     </w:p>
     <w:p>
@@ -14118,7 +13666,7 @@
           <w:rFonts w:ascii="Times New Roman" w:hAnsi="Times New Roman"/>
           <w:sz w:val="18"/>
         </w:rPr>
-        <w:t>Soave, G. (1972).  Equilibrium Constants from a Modified Redlich-Kwong Equation of State.  Chem. Eng. Sci., 27, 1197--1203.</w:t>
+        <w:t>[21]  Soave, G. (1972).  Equilibrium Constants from a Modified {Redlich-Kwong.  Chem. Eng. Sci., 27, 1197--1203.</w:t>
       </w:r>
     </w:p>
     <w:p>
@@ -14131,7 +13679,7 @@
           <w:rFonts w:ascii="Times New Roman" w:hAnsi="Times New Roman"/>
           <w:sz w:val="18"/>
         </w:rPr>
-        <w:t>Tikhonov, A. N. and Arsenin, V. Y. (1977).  Solutions of Ill-Posed Problems.  Winston.</w:t>
+        <w:t>[22]  Tikhonov, A. N. and Arsenin, V. Y. (1977).  Solutions of Ill-Posed Problems.  Winston.</w:t>
       </w:r>
     </w:p>
     <w:p>
@@ -14144,7 +13692,7 @@
           <w:rFonts w:ascii="Times New Roman" w:hAnsi="Times New Roman"/>
           <w:sz w:val="18"/>
         </w:rPr>
-        <w:t>Tsanas, C. and Stenby, E. H. and Yan, W. (2018).  Calculation of Multiphase Chemical Equilibrium by the Modified RAND Method.  Ind. Eng. Chem. Res., 57, 6815--6826.</w:t>
+        <w:t>[23]  Tsanas, C. and Stenby, E. H. and Yan, W. (2018).  Calculation of Multiphase Chemical Equilibrium by the Modified {RAND.  Ind. Eng. Chem. Res., 57, 6815--6826.</w:t>
       </w:r>
     </w:p>
     <w:p>
@@ -14157,7 +13705,7 @@
           <w:rFonts w:ascii="Times New Roman" w:hAnsi="Times New Roman"/>
           <w:sz w:val="18"/>
         </w:rPr>
-        <w:t>Villars, D. S. (1959).  A Method of Successive Approximations for Computing Combustion Equilibria on a High Speed Digital Computer.  J. Phys. Chem., 63, 521--525.</w:t>
+        <w:t>[24]  Villars, D. S. (1959).  A Method of Successive Approximations for Computing Combustion Equilibria on a High Speed Digital Computer.  J. Phys. Chem., 63, 521--525.</w:t>
       </w:r>
     </w:p>
     <w:p>
@@ -14170,7 +13718,7 @@
           <w:rFonts w:ascii="Times New Roman" w:hAnsi="Times New Roman"/>
           <w:sz w:val="18"/>
         </w:rPr>
-        <w:t>White, W. B. and Johnson, S. M. and Dantzig, G. B. (1958).  Chemical Equilibrium in Complex Mixtures.  J. Chem. Phys., 28, 751--755.</w:t>
+        <w:t>[25]  White, W. B. and Johnson, S. M. and Dantzig, G. B. (1958).  Chemical Equilibrium in Complex Mixtures.  J. Chem. Phys., 28, 751--755.</w:t>
       </w:r>
     </w:p>
     <w:sectPr>

</xml_diff>